<commit_message>
Re-ran scripts with new seeds
</commit_message>
<xml_diff>
--- a/docs/tables/Table_S1-3_mean_mpm_derived.docx
+++ b/docs/tables/Table_S1-3_mean_mpm_derived.docx
@@ -17,7 +17,11 @@
         <w:tblLook w:firstRow="1" w:lastRow="0" w:firstColumn="0" w:lastColumn="0" w:noHBand="0" w:noVBand="1"/>
       </w:tblPr>
       <w:tblGrid>
-        <w:gridCol w:w="10133"/>
+        <w:gridCol w:w="2954"/>
+        <w:gridCol w:w="1132"/>
+        <w:gridCol w:w="961"/>
+        <w:gridCol w:w="1034"/>
+        <w:gridCol w:w="1805"/>
       </w:tblGrid>
       <w:tr>
         <w:trPr>
@@ -73,16 +77,10 @@
                 <w:szCs w:val="22"/>
                 <w:color w:val="000000"/>
               </w:rPr>
-              <w:t xml:space="preserve">Note</w:t>
+              <w:t xml:space="preserve">Parameter</w:t>
             </w:r>
           </w:p>
         </w:tc>
-      </w:tr>
-      <w:tr>
-        <w:trPr>
-          <w:trHeight w:val="621" w:hRule="auto"/>
-        </w:trPr>
-        body1
         <w:tc>
           <w:tcPr>
             <w:tcBorders>
@@ -131,7 +129,961 @@
                 <w:szCs w:val="22"/>
                 <w:color w:val="000000"/>
               </w:rPr>
-              <w:t xml:space="preserve">Source data not yet generated: data/derived/analysis_cache/fig1_mean_mpm_param_summary.csv</w:t>
+              <w:t xml:space="preserve">Median</w:t>
+            </w:r>
+          </w:p>
+        </w:tc>
+        <w:tc>
+          <w:tcPr>
+            <w:tcBorders>
+              <w:bottom w:val="single" w:sz="12" w:space="0" w:color="666666"/>
+              <w:top w:val="single" w:sz="12" w:space="0" w:color="666666"/>
+              <w:left w:val="none" w:sz="0" w:space="0" w:color="000000"/>
+              <w:right w:val="none" w:sz="0" w:space="0" w:color="000000"/>
+            </w:tcBorders>
+            <w:shd w:val="clear" w:color="auto" w:fill="FFFFFF"/>
+            <w:tcMar>
+              <w:top w:w="0" w:type="dxa"/>
+              <w:bottom w:w="0" w:type="dxa"/>
+              <w:left w:w="0" w:type="dxa"/>
+              <w:right w:w="0" w:type="dxa"/>
+            </w:tcMar>
+            <w:vAlign w:val="center"/>
+          </w:tcPr>
+          <w:p>
+            <w:pPr>
+              <w:jc w:val="left"/>
+              <w:pBdr>
+                <w:bottom w:val="none" w:sz="0" w:space="0" w:color="000000"/>
+                <w:top w:val="none" w:sz="0" w:space="0" w:color="000000"/>
+                <w:left w:val="none" w:sz="0" w:space="0" w:color="000000"/>
+                <w:right w:val="none" w:sz="0" w:space="0" w:color="000000"/>
+              </w:pBdr>
+              <w:spacing w:after="100" w:before="100" w:line="240"/>
+              <w:ind w:left="100" w:right="100" w:firstLine="0" w:firstLineChars="0"/>
+              <w:rPr>
+                <w:rFonts w:ascii="Helvetica" w:hAnsi="Helvetica" w:eastAsia="Helvetica" w:cs="Helvetica"/>
+                <w:i w:val="false"/>
+                <w:b w:val="false"/>
+                <w:u w:val="none"/>
+                <w:sz w:val="22"/>
+                <w:szCs w:val="22"/>
+                <w:color w:val="000000"/>
+              </w:rPr>
+            </w:pPr>
+            <w:r>
+              <w:rPr>
+                <w:rFonts w:ascii="Helvetica" w:hAnsi="Helvetica" w:eastAsia="Helvetica" w:cs="Helvetica"/>
+                <w:i w:val="false"/>
+                <w:b w:val="false"/>
+                <w:u w:val="none"/>
+                <w:sz w:val="22"/>
+                <w:szCs w:val="22"/>
+                <w:color w:val="000000"/>
+              </w:rPr>
+              <w:t xml:space="preserve">2.5%</w:t>
+            </w:r>
+          </w:p>
+        </w:tc>
+        <w:tc>
+          <w:tcPr>
+            <w:tcBorders>
+              <w:bottom w:val="single" w:sz="12" w:space="0" w:color="666666"/>
+              <w:top w:val="single" w:sz="12" w:space="0" w:color="666666"/>
+              <w:left w:val="none" w:sz="0" w:space="0" w:color="000000"/>
+              <w:right w:val="none" w:sz="0" w:space="0" w:color="000000"/>
+            </w:tcBorders>
+            <w:shd w:val="clear" w:color="auto" w:fill="FFFFFF"/>
+            <w:tcMar>
+              <w:top w:w="0" w:type="dxa"/>
+              <w:bottom w:w="0" w:type="dxa"/>
+              <w:left w:w="0" w:type="dxa"/>
+              <w:right w:w="0" w:type="dxa"/>
+            </w:tcMar>
+            <w:vAlign w:val="center"/>
+          </w:tcPr>
+          <w:p>
+            <w:pPr>
+              <w:jc w:val="left"/>
+              <w:pBdr>
+                <w:bottom w:val="none" w:sz="0" w:space="0" w:color="000000"/>
+                <w:top w:val="none" w:sz="0" w:space="0" w:color="000000"/>
+                <w:left w:val="none" w:sz="0" w:space="0" w:color="000000"/>
+                <w:right w:val="none" w:sz="0" w:space="0" w:color="000000"/>
+              </w:pBdr>
+              <w:spacing w:after="100" w:before="100" w:line="240"/>
+              <w:ind w:left="100" w:right="100" w:firstLine="0" w:firstLineChars="0"/>
+              <w:rPr>
+                <w:rFonts w:ascii="Helvetica" w:hAnsi="Helvetica" w:eastAsia="Helvetica" w:cs="Helvetica"/>
+                <w:i w:val="false"/>
+                <w:b w:val="false"/>
+                <w:u w:val="none"/>
+                <w:sz w:val="22"/>
+                <w:szCs w:val="22"/>
+                <w:color w:val="000000"/>
+              </w:rPr>
+            </w:pPr>
+            <w:r>
+              <w:rPr>
+                <w:rFonts w:ascii="Helvetica" w:hAnsi="Helvetica" w:eastAsia="Helvetica" w:cs="Helvetica"/>
+                <w:i w:val="false"/>
+                <w:b w:val="false"/>
+                <w:u w:val="none"/>
+                <w:sz w:val="22"/>
+                <w:szCs w:val="22"/>
+                <w:color w:val="000000"/>
+              </w:rPr>
+              <w:t xml:space="preserve">97.5%</w:t>
+            </w:r>
+          </w:p>
+        </w:tc>
+        <w:tc>
+          <w:tcPr>
+            <w:tcBorders>
+              <w:bottom w:val="single" w:sz="12" w:space="0" w:color="666666"/>
+              <w:top w:val="single" w:sz="12" w:space="0" w:color="666666"/>
+              <w:left w:val="none" w:sz="0" w:space="0" w:color="000000"/>
+              <w:right w:val="none" w:sz="0" w:space="0" w:color="000000"/>
+            </w:tcBorders>
+            <w:shd w:val="clear" w:color="auto" w:fill="FFFFFF"/>
+            <w:tcMar>
+              <w:top w:w="0" w:type="dxa"/>
+              <w:bottom w:w="0" w:type="dxa"/>
+              <w:left w:w="0" w:type="dxa"/>
+              <w:right w:w="0" w:type="dxa"/>
+            </w:tcMar>
+            <w:vAlign w:val="center"/>
+          </w:tcPr>
+          <w:p>
+            <w:pPr>
+              <w:jc w:val="left"/>
+              <w:pBdr>
+                <w:bottom w:val="none" w:sz="0" w:space="0" w:color="000000"/>
+                <w:top w:val="none" w:sz="0" w:space="0" w:color="000000"/>
+                <w:left w:val="none" w:sz="0" w:space="0" w:color="000000"/>
+                <w:right w:val="none" w:sz="0" w:space="0" w:color="000000"/>
+              </w:pBdr>
+              <w:spacing w:after="100" w:before="100" w:line="240"/>
+              <w:ind w:left="100" w:right="100" w:firstLine="0" w:firstLineChars="0"/>
+              <w:rPr>
+                <w:rFonts w:ascii="Helvetica" w:hAnsi="Helvetica" w:eastAsia="Helvetica" w:cs="Helvetica"/>
+                <w:i w:val="false"/>
+                <w:b w:val="false"/>
+                <w:u w:val="none"/>
+                <w:sz w:val="22"/>
+                <w:szCs w:val="22"/>
+                <w:color w:val="000000"/>
+              </w:rPr>
+            </w:pPr>
+            <w:r>
+              <w:rPr>
+                <w:rFonts w:ascii="Helvetica" w:hAnsi="Helvetica" w:eastAsia="Helvetica" w:cs="Helvetica"/>
+                <w:i w:val="false"/>
+                <w:b w:val="false"/>
+                <w:u w:val="none"/>
+                <w:sz w:val="22"/>
+                <w:szCs w:val="22"/>
+                <w:color w:val="000000"/>
+              </w:rPr>
+              <w:t xml:space="preserve">Point estimate</w:t>
+            </w:r>
+          </w:p>
+        </w:tc>
+      </w:tr>
+      <w:tr>
+        <w:trPr>
+          <w:trHeight w:val="618" w:hRule="auto"/>
+        </w:trPr>
+        body1
+        <w:tc>
+          <w:tcPr>
+            <w:tcBorders>
+              <w:bottom w:val="none" w:sz="0" w:space="0" w:color="000000"/>
+              <w:top w:val="single" w:sz="12" w:space="0" w:color="666666"/>
+              <w:left w:val="none" w:sz="0" w:space="0" w:color="000000"/>
+              <w:right w:val="none" w:sz="0" w:space="0" w:color="000000"/>
+            </w:tcBorders>
+            <w:shd w:val="clear" w:color="auto" w:fill="FFFFFF"/>
+            <w:tcMar>
+              <w:top w:w="0" w:type="dxa"/>
+              <w:bottom w:w="0" w:type="dxa"/>
+              <w:left w:w="0" w:type="dxa"/>
+              <w:right w:w="0" w:type="dxa"/>
+            </w:tcMar>
+            <w:vAlign w:val="center"/>
+          </w:tcPr>
+          <w:p>
+            <w:pPr>
+              <w:jc w:val="left"/>
+              <w:pBdr>
+                <w:bottom w:val="none" w:sz="0" w:space="0" w:color="000000"/>
+                <w:top w:val="none" w:sz="0" w:space="0" w:color="000000"/>
+                <w:left w:val="none" w:sz="0" w:space="0" w:color="000000"/>
+                <w:right w:val="none" w:sz="0" w:space="0" w:color="000000"/>
+              </w:pBdr>
+              <w:spacing w:after="100" w:before="100" w:line="240"/>
+              <w:ind w:left="100" w:right="100" w:firstLine="0" w:firstLineChars="0"/>
+              <w:rPr>
+                <w:rFonts w:ascii="Helvetica" w:hAnsi="Helvetica" w:eastAsia="Helvetica" w:cs="Helvetica"/>
+                <w:i w:val="false"/>
+                <w:b w:val="false"/>
+                <w:u w:val="none"/>
+                <w:sz w:val="22"/>
+                <w:szCs w:val="22"/>
+                <w:color w:val="000000"/>
+              </w:rPr>
+            </w:pPr>
+            <w:r>
+              <w:rPr>
+                <w:rFonts w:ascii="Helvetica" w:hAnsi="Helvetica" w:eastAsia="Helvetica" w:cs="Helvetica"/>
+                <w:i w:val="false"/>
+                <w:b w:val="false"/>
+                <w:u w:val="none"/>
+                <w:sz w:val="22"/>
+                <w:szCs w:val="22"/>
+                <w:color w:val="000000"/>
+              </w:rPr>
+              <w:t xml:space="preserve">Life expectancy (l[0])</w:t>
+            </w:r>
+          </w:p>
+        </w:tc>
+        <w:tc>
+          <w:tcPr>
+            <w:tcBorders>
+              <w:bottom w:val="none" w:sz="0" w:space="0" w:color="000000"/>
+              <w:top w:val="single" w:sz="12" w:space="0" w:color="666666"/>
+              <w:left w:val="none" w:sz="0" w:space="0" w:color="000000"/>
+              <w:right w:val="none" w:sz="0" w:space="0" w:color="000000"/>
+            </w:tcBorders>
+            <w:shd w:val="clear" w:color="auto" w:fill="FFFFFF"/>
+            <w:tcMar>
+              <w:top w:w="0" w:type="dxa"/>
+              <w:bottom w:w="0" w:type="dxa"/>
+              <w:left w:w="0" w:type="dxa"/>
+              <w:right w:w="0" w:type="dxa"/>
+            </w:tcMar>
+            <w:vAlign w:val="center"/>
+          </w:tcPr>
+          <w:p>
+            <w:pPr>
+              <w:jc w:val="left"/>
+              <w:pBdr>
+                <w:bottom w:val="none" w:sz="0" w:space="0" w:color="000000"/>
+                <w:top w:val="none" w:sz="0" w:space="0" w:color="000000"/>
+                <w:left w:val="none" w:sz="0" w:space="0" w:color="000000"/>
+                <w:right w:val="none" w:sz="0" w:space="0" w:color="000000"/>
+              </w:pBdr>
+              <w:spacing w:after="100" w:before="100" w:line="240"/>
+              <w:ind w:left="100" w:right="100" w:firstLine="0" w:firstLineChars="0"/>
+              <w:rPr>
+                <w:rFonts w:ascii="Helvetica" w:hAnsi="Helvetica" w:eastAsia="Helvetica" w:cs="Helvetica"/>
+                <w:i w:val="false"/>
+                <w:b w:val="false"/>
+                <w:u w:val="none"/>
+                <w:sz w:val="22"/>
+                <w:szCs w:val="22"/>
+                <w:color w:val="000000"/>
+              </w:rPr>
+            </w:pPr>
+            <w:r>
+              <w:rPr>
+                <w:rFonts w:ascii="Helvetica" w:hAnsi="Helvetica" w:eastAsia="Helvetica" w:cs="Helvetica"/>
+                <w:i w:val="false"/>
+                <w:b w:val="false"/>
+                <w:u w:val="none"/>
+                <w:sz w:val="22"/>
+                <w:szCs w:val="22"/>
+                <w:color w:val="000000"/>
+              </w:rPr>
+              <w:t xml:space="preserve">1.920</w:t>
+            </w:r>
+          </w:p>
+        </w:tc>
+        <w:tc>
+          <w:tcPr>
+            <w:tcBorders>
+              <w:bottom w:val="none" w:sz="0" w:space="0" w:color="000000"/>
+              <w:top w:val="single" w:sz="12" w:space="0" w:color="666666"/>
+              <w:left w:val="none" w:sz="0" w:space="0" w:color="000000"/>
+              <w:right w:val="none" w:sz="0" w:space="0" w:color="000000"/>
+            </w:tcBorders>
+            <w:shd w:val="clear" w:color="auto" w:fill="FFFFFF"/>
+            <w:tcMar>
+              <w:top w:w="0" w:type="dxa"/>
+              <w:bottom w:w="0" w:type="dxa"/>
+              <w:left w:w="0" w:type="dxa"/>
+              <w:right w:w="0" w:type="dxa"/>
+            </w:tcMar>
+            <w:vAlign w:val="center"/>
+          </w:tcPr>
+          <w:p>
+            <w:pPr>
+              <w:jc w:val="left"/>
+              <w:pBdr>
+                <w:bottom w:val="none" w:sz="0" w:space="0" w:color="000000"/>
+                <w:top w:val="none" w:sz="0" w:space="0" w:color="000000"/>
+                <w:left w:val="none" w:sz="0" w:space="0" w:color="000000"/>
+                <w:right w:val="none" w:sz="0" w:space="0" w:color="000000"/>
+              </w:pBdr>
+              <w:spacing w:after="100" w:before="100" w:line="240"/>
+              <w:ind w:left="100" w:right="100" w:firstLine="0" w:firstLineChars="0"/>
+              <w:rPr>
+                <w:rFonts w:ascii="Helvetica" w:hAnsi="Helvetica" w:eastAsia="Helvetica" w:cs="Helvetica"/>
+                <w:i w:val="false"/>
+                <w:b w:val="false"/>
+                <w:u w:val="none"/>
+                <w:sz w:val="22"/>
+                <w:szCs w:val="22"/>
+                <w:color w:val="000000"/>
+              </w:rPr>
+            </w:pPr>
+            <w:r>
+              <w:rPr>
+                <w:rFonts w:ascii="Helvetica" w:hAnsi="Helvetica" w:eastAsia="Helvetica" w:cs="Helvetica"/>
+                <w:i w:val="false"/>
+                <w:b w:val="false"/>
+                <w:u w:val="none"/>
+                <w:sz w:val="22"/>
+                <w:szCs w:val="22"/>
+                <w:color w:val="000000"/>
+              </w:rPr>
+              <w:t xml:space="preserve">1.700</w:t>
+            </w:r>
+          </w:p>
+        </w:tc>
+        <w:tc>
+          <w:tcPr>
+            <w:tcBorders>
+              <w:bottom w:val="none" w:sz="0" w:space="0" w:color="000000"/>
+              <w:top w:val="single" w:sz="12" w:space="0" w:color="666666"/>
+              <w:left w:val="none" w:sz="0" w:space="0" w:color="000000"/>
+              <w:right w:val="none" w:sz="0" w:space="0" w:color="000000"/>
+            </w:tcBorders>
+            <w:shd w:val="clear" w:color="auto" w:fill="FFFFFF"/>
+            <w:tcMar>
+              <w:top w:w="0" w:type="dxa"/>
+              <w:bottom w:w="0" w:type="dxa"/>
+              <w:left w:w="0" w:type="dxa"/>
+              <w:right w:w="0" w:type="dxa"/>
+            </w:tcMar>
+            <w:vAlign w:val="center"/>
+          </w:tcPr>
+          <w:p>
+            <w:pPr>
+              <w:jc w:val="left"/>
+              <w:pBdr>
+                <w:bottom w:val="none" w:sz="0" w:space="0" w:color="000000"/>
+                <w:top w:val="none" w:sz="0" w:space="0" w:color="000000"/>
+                <w:left w:val="none" w:sz="0" w:space="0" w:color="000000"/>
+                <w:right w:val="none" w:sz="0" w:space="0" w:color="000000"/>
+              </w:pBdr>
+              <w:spacing w:after="100" w:before="100" w:line="240"/>
+              <w:ind w:left="100" w:right="100" w:firstLine="0" w:firstLineChars="0"/>
+              <w:rPr>
+                <w:rFonts w:ascii="Helvetica" w:hAnsi="Helvetica" w:eastAsia="Helvetica" w:cs="Helvetica"/>
+                <w:i w:val="false"/>
+                <w:b w:val="false"/>
+                <w:u w:val="none"/>
+                <w:sz w:val="22"/>
+                <w:szCs w:val="22"/>
+                <w:color w:val="000000"/>
+              </w:rPr>
+            </w:pPr>
+            <w:r>
+              <w:rPr>
+                <w:rFonts w:ascii="Helvetica" w:hAnsi="Helvetica" w:eastAsia="Helvetica" w:cs="Helvetica"/>
+                <w:i w:val="false"/>
+                <w:b w:val="false"/>
+                <w:u w:val="none"/>
+                <w:sz w:val="22"/>
+                <w:szCs w:val="22"/>
+                <w:color w:val="000000"/>
+              </w:rPr>
+              <w:t xml:space="preserve">2.18</w:t>
+            </w:r>
+          </w:p>
+        </w:tc>
+        <w:tc>
+          <w:tcPr>
+            <w:tcBorders>
+              <w:bottom w:val="none" w:sz="0" w:space="0" w:color="000000"/>
+              <w:top w:val="single" w:sz="12" w:space="0" w:color="666666"/>
+              <w:left w:val="none" w:sz="0" w:space="0" w:color="000000"/>
+              <w:right w:val="none" w:sz="0" w:space="0" w:color="000000"/>
+            </w:tcBorders>
+            <w:shd w:val="clear" w:color="auto" w:fill="FFFFFF"/>
+            <w:tcMar>
+              <w:top w:w="0" w:type="dxa"/>
+              <w:bottom w:w="0" w:type="dxa"/>
+              <w:left w:w="0" w:type="dxa"/>
+              <w:right w:w="0" w:type="dxa"/>
+            </w:tcMar>
+            <w:vAlign w:val="center"/>
+          </w:tcPr>
+          <w:p>
+            <w:pPr>
+              <w:jc w:val="left"/>
+              <w:pBdr>
+                <w:bottom w:val="none" w:sz="0" w:space="0" w:color="000000"/>
+                <w:top w:val="none" w:sz="0" w:space="0" w:color="000000"/>
+                <w:left w:val="none" w:sz="0" w:space="0" w:color="000000"/>
+                <w:right w:val="none" w:sz="0" w:space="0" w:color="000000"/>
+              </w:pBdr>
+              <w:spacing w:after="100" w:before="100" w:line="240"/>
+              <w:ind w:left="100" w:right="100" w:firstLine="0" w:firstLineChars="0"/>
+              <w:rPr>
+                <w:rFonts w:ascii="Helvetica" w:hAnsi="Helvetica" w:eastAsia="Helvetica" w:cs="Helvetica"/>
+                <w:i w:val="false"/>
+                <w:b w:val="false"/>
+                <w:u w:val="none"/>
+                <w:sz w:val="22"/>
+                <w:szCs w:val="22"/>
+                <w:color w:val="000000"/>
+              </w:rPr>
+            </w:pPr>
+            <w:r>
+              <w:rPr>
+                <w:rFonts w:ascii="Helvetica" w:hAnsi="Helvetica" w:eastAsia="Helvetica" w:cs="Helvetica"/>
+                <w:i w:val="false"/>
+                <w:b w:val="false"/>
+                <w:u w:val="none"/>
+                <w:sz w:val="22"/>
+                <w:szCs w:val="22"/>
+                <w:color w:val="000000"/>
+              </w:rPr>
+              <w:t xml:space="preserve">1.930</w:t>
+            </w:r>
+          </w:p>
+        </w:tc>
+      </w:tr>
+      <w:tr>
+        <w:trPr>
+          <w:trHeight w:val="620" w:hRule="auto"/>
+        </w:trPr>
+        body2
+        <w:tc>
+          <w:tcPr>
+            <w:tcBorders>
+              <w:bottom w:val="none" w:sz="0" w:space="0" w:color="000000"/>
+              <w:top w:val="none" w:sz="0" w:space="0" w:color="000000"/>
+              <w:left w:val="none" w:sz="0" w:space="0" w:color="000000"/>
+              <w:right w:val="none" w:sz="0" w:space="0" w:color="000000"/>
+            </w:tcBorders>
+            <w:shd w:val="clear" w:color="auto" w:fill="FFFFFF"/>
+            <w:tcMar>
+              <w:top w:w="0" w:type="dxa"/>
+              <w:bottom w:w="0" w:type="dxa"/>
+              <w:left w:w="0" w:type="dxa"/>
+              <w:right w:w="0" w:type="dxa"/>
+            </w:tcMar>
+            <w:vAlign w:val="center"/>
+          </w:tcPr>
+          <w:p>
+            <w:pPr>
+              <w:jc w:val="left"/>
+              <w:pBdr>
+                <w:bottom w:val="none" w:sz="0" w:space="0" w:color="000000"/>
+                <w:top w:val="none" w:sz="0" w:space="0" w:color="000000"/>
+                <w:left w:val="none" w:sz="0" w:space="0" w:color="000000"/>
+                <w:right w:val="none" w:sz="0" w:space="0" w:color="000000"/>
+              </w:pBdr>
+              <w:spacing w:after="100" w:before="100" w:line="240"/>
+              <w:ind w:left="100" w:right="100" w:firstLine="0" w:firstLineChars="0"/>
+              <w:rPr>
+                <w:rFonts w:ascii="Helvetica" w:hAnsi="Helvetica" w:eastAsia="Helvetica" w:cs="Helvetica"/>
+                <w:i w:val="false"/>
+                <w:b w:val="false"/>
+                <w:u w:val="none"/>
+                <w:sz w:val="22"/>
+                <w:szCs w:val="22"/>
+                <w:color w:val="000000"/>
+              </w:rPr>
+            </w:pPr>
+            <w:r>
+              <w:rPr>
+                <w:rFonts w:ascii="Helvetica" w:hAnsi="Helvetica" w:eastAsia="Helvetica" w:cs="Helvetica"/>
+                <w:i w:val="false"/>
+                <w:b w:val="false"/>
+                <w:u w:val="none"/>
+                <w:sz w:val="22"/>
+                <w:szCs w:val="22"/>
+                <w:color w:val="000000"/>
+              </w:rPr>
+              <w:t xml:space="preserve">Pop. growth rate (lambda)</w:t>
+            </w:r>
+          </w:p>
+        </w:tc>
+        <w:tc>
+          <w:tcPr>
+            <w:tcBorders>
+              <w:bottom w:val="none" w:sz="0" w:space="0" w:color="000000"/>
+              <w:top w:val="none" w:sz="0" w:space="0" w:color="000000"/>
+              <w:left w:val="none" w:sz="0" w:space="0" w:color="000000"/>
+              <w:right w:val="none" w:sz="0" w:space="0" w:color="000000"/>
+            </w:tcBorders>
+            <w:shd w:val="clear" w:color="auto" w:fill="FFFFFF"/>
+            <w:tcMar>
+              <w:top w:w="0" w:type="dxa"/>
+              <w:bottom w:w="0" w:type="dxa"/>
+              <w:left w:w="0" w:type="dxa"/>
+              <w:right w:w="0" w:type="dxa"/>
+            </w:tcMar>
+            <w:vAlign w:val="center"/>
+          </w:tcPr>
+          <w:p>
+            <w:pPr>
+              <w:jc w:val="left"/>
+              <w:pBdr>
+                <w:bottom w:val="none" w:sz="0" w:space="0" w:color="000000"/>
+                <w:top w:val="none" w:sz="0" w:space="0" w:color="000000"/>
+                <w:left w:val="none" w:sz="0" w:space="0" w:color="000000"/>
+                <w:right w:val="none" w:sz="0" w:space="0" w:color="000000"/>
+              </w:pBdr>
+              <w:spacing w:after="100" w:before="100" w:line="240"/>
+              <w:ind w:left="100" w:right="100" w:firstLine="0" w:firstLineChars="0"/>
+              <w:rPr>
+                <w:rFonts w:ascii="Helvetica" w:hAnsi="Helvetica" w:eastAsia="Helvetica" w:cs="Helvetica"/>
+                <w:i w:val="false"/>
+                <w:b w:val="false"/>
+                <w:u w:val="none"/>
+                <w:sz w:val="22"/>
+                <w:szCs w:val="22"/>
+                <w:color w:val="000000"/>
+              </w:rPr>
+            </w:pPr>
+            <w:r>
+              <w:rPr>
+                <w:rFonts w:ascii="Helvetica" w:hAnsi="Helvetica" w:eastAsia="Helvetica" w:cs="Helvetica"/>
+                <w:i w:val="false"/>
+                <w:b w:val="false"/>
+                <w:u w:val="none"/>
+                <w:sz w:val="22"/>
+                <w:szCs w:val="22"/>
+                <w:color w:val="000000"/>
+              </w:rPr>
+              <w:t xml:space="preserve">0.929</w:t>
+            </w:r>
+          </w:p>
+        </w:tc>
+        <w:tc>
+          <w:tcPr>
+            <w:tcBorders>
+              <w:bottom w:val="none" w:sz="0" w:space="0" w:color="000000"/>
+              <w:top w:val="none" w:sz="0" w:space="0" w:color="000000"/>
+              <w:left w:val="none" w:sz="0" w:space="0" w:color="000000"/>
+              <w:right w:val="none" w:sz="0" w:space="0" w:color="000000"/>
+            </w:tcBorders>
+            <w:shd w:val="clear" w:color="auto" w:fill="FFFFFF"/>
+            <w:tcMar>
+              <w:top w:w="0" w:type="dxa"/>
+              <w:bottom w:w="0" w:type="dxa"/>
+              <w:left w:w="0" w:type="dxa"/>
+              <w:right w:w="0" w:type="dxa"/>
+            </w:tcMar>
+            <w:vAlign w:val="center"/>
+          </w:tcPr>
+          <w:p>
+            <w:pPr>
+              <w:jc w:val="left"/>
+              <w:pBdr>
+                <w:bottom w:val="none" w:sz="0" w:space="0" w:color="000000"/>
+                <w:top w:val="none" w:sz="0" w:space="0" w:color="000000"/>
+                <w:left w:val="none" w:sz="0" w:space="0" w:color="000000"/>
+                <w:right w:val="none" w:sz="0" w:space="0" w:color="000000"/>
+              </w:pBdr>
+              <w:spacing w:after="100" w:before="100" w:line="240"/>
+              <w:ind w:left="100" w:right="100" w:firstLine="0" w:firstLineChars="0"/>
+              <w:rPr>
+                <w:rFonts w:ascii="Helvetica" w:hAnsi="Helvetica" w:eastAsia="Helvetica" w:cs="Helvetica"/>
+                <w:i w:val="false"/>
+                <w:b w:val="false"/>
+                <w:u w:val="none"/>
+                <w:sz w:val="22"/>
+                <w:szCs w:val="22"/>
+                <w:color w:val="000000"/>
+              </w:rPr>
+            </w:pPr>
+            <w:r>
+              <w:rPr>
+                <w:rFonts w:ascii="Helvetica" w:hAnsi="Helvetica" w:eastAsia="Helvetica" w:cs="Helvetica"/>
+                <w:i w:val="false"/>
+                <w:b w:val="false"/>
+                <w:u w:val="none"/>
+                <w:sz w:val="22"/>
+                <w:szCs w:val="22"/>
+                <w:color w:val="000000"/>
+              </w:rPr>
+              <w:t xml:space="preserve">0.826</w:t>
+            </w:r>
+          </w:p>
+        </w:tc>
+        <w:tc>
+          <w:tcPr>
+            <w:tcBorders>
+              <w:bottom w:val="none" w:sz="0" w:space="0" w:color="000000"/>
+              <w:top w:val="none" w:sz="0" w:space="0" w:color="000000"/>
+              <w:left w:val="none" w:sz="0" w:space="0" w:color="000000"/>
+              <w:right w:val="none" w:sz="0" w:space="0" w:color="000000"/>
+            </w:tcBorders>
+            <w:shd w:val="clear" w:color="auto" w:fill="FFFFFF"/>
+            <w:tcMar>
+              <w:top w:w="0" w:type="dxa"/>
+              <w:bottom w:w="0" w:type="dxa"/>
+              <w:left w:w="0" w:type="dxa"/>
+              <w:right w:w="0" w:type="dxa"/>
+            </w:tcMar>
+            <w:vAlign w:val="center"/>
+          </w:tcPr>
+          <w:p>
+            <w:pPr>
+              <w:jc w:val="left"/>
+              <w:pBdr>
+                <w:bottom w:val="none" w:sz="0" w:space="0" w:color="000000"/>
+                <w:top w:val="none" w:sz="0" w:space="0" w:color="000000"/>
+                <w:left w:val="none" w:sz="0" w:space="0" w:color="000000"/>
+                <w:right w:val="none" w:sz="0" w:space="0" w:color="000000"/>
+              </w:pBdr>
+              <w:spacing w:after="100" w:before="100" w:line="240"/>
+              <w:ind w:left="100" w:right="100" w:firstLine="0" w:firstLineChars="0"/>
+              <w:rPr>
+                <w:rFonts w:ascii="Helvetica" w:hAnsi="Helvetica" w:eastAsia="Helvetica" w:cs="Helvetica"/>
+                <w:i w:val="false"/>
+                <w:b w:val="false"/>
+                <w:u w:val="none"/>
+                <w:sz w:val="22"/>
+                <w:szCs w:val="22"/>
+                <w:color w:val="000000"/>
+              </w:rPr>
+            </w:pPr>
+            <w:r>
+              <w:rPr>
+                <w:rFonts w:ascii="Helvetica" w:hAnsi="Helvetica" w:eastAsia="Helvetica" w:cs="Helvetica"/>
+                <w:i w:val="false"/>
+                <w:b w:val="false"/>
+                <w:u w:val="none"/>
+                <w:sz w:val="22"/>
+                <w:szCs w:val="22"/>
+                <w:color w:val="000000"/>
+              </w:rPr>
+              <w:t xml:space="preserve">1.03</w:t>
+            </w:r>
+          </w:p>
+        </w:tc>
+        <w:tc>
+          <w:tcPr>
+            <w:tcBorders>
+              <w:bottom w:val="none" w:sz="0" w:space="0" w:color="000000"/>
+              <w:top w:val="none" w:sz="0" w:space="0" w:color="000000"/>
+              <w:left w:val="none" w:sz="0" w:space="0" w:color="000000"/>
+              <w:right w:val="none" w:sz="0" w:space="0" w:color="000000"/>
+            </w:tcBorders>
+            <w:shd w:val="clear" w:color="auto" w:fill="FFFFFF"/>
+            <w:tcMar>
+              <w:top w:w="0" w:type="dxa"/>
+              <w:bottom w:w="0" w:type="dxa"/>
+              <w:left w:w="0" w:type="dxa"/>
+              <w:right w:w="0" w:type="dxa"/>
+            </w:tcMar>
+            <w:vAlign w:val="center"/>
+          </w:tcPr>
+          <w:p>
+            <w:pPr>
+              <w:jc w:val="left"/>
+              <w:pBdr>
+                <w:bottom w:val="none" w:sz="0" w:space="0" w:color="000000"/>
+                <w:top w:val="none" w:sz="0" w:space="0" w:color="000000"/>
+                <w:left w:val="none" w:sz="0" w:space="0" w:color="000000"/>
+                <w:right w:val="none" w:sz="0" w:space="0" w:color="000000"/>
+              </w:pBdr>
+              <w:spacing w:after="100" w:before="100" w:line="240"/>
+              <w:ind w:left="100" w:right="100" w:firstLine="0" w:firstLineChars="0"/>
+              <w:rPr>
+                <w:rFonts w:ascii="Helvetica" w:hAnsi="Helvetica" w:eastAsia="Helvetica" w:cs="Helvetica"/>
+                <w:i w:val="false"/>
+                <w:b w:val="false"/>
+                <w:u w:val="none"/>
+                <w:sz w:val="22"/>
+                <w:szCs w:val="22"/>
+                <w:color w:val="000000"/>
+              </w:rPr>
+            </w:pPr>
+            <w:r>
+              <w:rPr>
+                <w:rFonts w:ascii="Helvetica" w:hAnsi="Helvetica" w:eastAsia="Helvetica" w:cs="Helvetica"/>
+                <w:i w:val="false"/>
+                <w:b w:val="false"/>
+                <w:u w:val="none"/>
+                <w:sz w:val="22"/>
+                <w:szCs w:val="22"/>
+                <w:color w:val="000000"/>
+              </w:rPr>
+              <w:t xml:space="preserve">0.958</w:t>
+            </w:r>
+          </w:p>
+        </w:tc>
+      </w:tr>
+      <w:tr>
+        <w:trPr>
+          <w:trHeight w:val="620" w:hRule="auto"/>
+        </w:trPr>
+        body3
+        <w:tc>
+          <w:tcPr>
+            <w:tcBorders>
+              <w:bottom w:val="single" w:sz="12" w:space="0" w:color="666666"/>
+              <w:top w:val="none" w:sz="0" w:space="0" w:color="000000"/>
+              <w:left w:val="none" w:sz="0" w:space="0" w:color="000000"/>
+              <w:right w:val="none" w:sz="0" w:space="0" w:color="000000"/>
+            </w:tcBorders>
+            <w:shd w:val="clear" w:color="auto" w:fill="FFFFFF"/>
+            <w:tcMar>
+              <w:top w:w="0" w:type="dxa"/>
+              <w:bottom w:w="0" w:type="dxa"/>
+              <w:left w:w="0" w:type="dxa"/>
+              <w:right w:w="0" w:type="dxa"/>
+            </w:tcMar>
+            <w:vAlign w:val="center"/>
+          </w:tcPr>
+          <w:p>
+            <w:pPr>
+              <w:jc w:val="left"/>
+              <w:pBdr>
+                <w:bottom w:val="none" w:sz="0" w:space="0" w:color="000000"/>
+                <w:top w:val="none" w:sz="0" w:space="0" w:color="000000"/>
+                <w:left w:val="none" w:sz="0" w:space="0" w:color="000000"/>
+                <w:right w:val="none" w:sz="0" w:space="0" w:color="000000"/>
+              </w:pBdr>
+              <w:spacing w:after="100" w:before="100" w:line="240"/>
+              <w:ind w:left="100" w:right="100" w:firstLine="0" w:firstLineChars="0"/>
+              <w:rPr>
+                <w:rFonts w:ascii="Helvetica" w:hAnsi="Helvetica" w:eastAsia="Helvetica" w:cs="Helvetica"/>
+                <w:i w:val="false"/>
+                <w:b w:val="false"/>
+                <w:u w:val="none"/>
+                <w:sz w:val="22"/>
+                <w:szCs w:val="22"/>
+                <w:color w:val="000000"/>
+              </w:rPr>
+            </w:pPr>
+            <w:r>
+              <w:rPr>
+                <w:rFonts w:ascii="Helvetica" w:hAnsi="Helvetica" w:eastAsia="Helvetica" w:cs="Helvetica"/>
+                <w:i w:val="false"/>
+                <w:b w:val="false"/>
+                <w:u w:val="none"/>
+                <w:sz w:val="22"/>
+                <w:szCs w:val="22"/>
+                <w:color w:val="000000"/>
+              </w:rPr>
+              <w:t xml:space="preserve">Damping ratio (rho)</w:t>
+            </w:r>
+          </w:p>
+        </w:tc>
+        <w:tc>
+          <w:tcPr>
+            <w:tcBorders>
+              <w:bottom w:val="single" w:sz="12" w:space="0" w:color="666666"/>
+              <w:top w:val="none" w:sz="0" w:space="0" w:color="000000"/>
+              <w:left w:val="none" w:sz="0" w:space="0" w:color="000000"/>
+              <w:right w:val="none" w:sz="0" w:space="0" w:color="000000"/>
+            </w:tcBorders>
+            <w:shd w:val="clear" w:color="auto" w:fill="FFFFFF"/>
+            <w:tcMar>
+              <w:top w:w="0" w:type="dxa"/>
+              <w:bottom w:w="0" w:type="dxa"/>
+              <w:left w:w="0" w:type="dxa"/>
+              <w:right w:w="0" w:type="dxa"/>
+            </w:tcMar>
+            <w:vAlign w:val="center"/>
+          </w:tcPr>
+          <w:p>
+            <w:pPr>
+              <w:jc w:val="left"/>
+              <w:pBdr>
+                <w:bottom w:val="none" w:sz="0" w:space="0" w:color="000000"/>
+                <w:top w:val="none" w:sz="0" w:space="0" w:color="000000"/>
+                <w:left w:val="none" w:sz="0" w:space="0" w:color="000000"/>
+                <w:right w:val="none" w:sz="0" w:space="0" w:color="000000"/>
+              </w:pBdr>
+              <w:spacing w:after="100" w:before="100" w:line="240"/>
+              <w:ind w:left="100" w:right="100" w:firstLine="0" w:firstLineChars="0"/>
+              <w:rPr>
+                <w:rFonts w:ascii="Helvetica" w:hAnsi="Helvetica" w:eastAsia="Helvetica" w:cs="Helvetica"/>
+                <w:i w:val="false"/>
+                <w:b w:val="false"/>
+                <w:u w:val="none"/>
+                <w:sz w:val="22"/>
+                <w:szCs w:val="22"/>
+                <w:color w:val="000000"/>
+              </w:rPr>
+            </w:pPr>
+            <w:r>
+              <w:rPr>
+                <w:rFonts w:ascii="Helvetica" w:hAnsi="Helvetica" w:eastAsia="Helvetica" w:cs="Helvetica"/>
+                <w:i w:val="false"/>
+                <w:b w:val="false"/>
+                <w:u w:val="none"/>
+                <w:sz w:val="22"/>
+                <w:szCs w:val="22"/>
+                <w:color w:val="000000"/>
+              </w:rPr>
+              <w:t xml:space="preserve">1.430</w:t>
+            </w:r>
+          </w:p>
+        </w:tc>
+        <w:tc>
+          <w:tcPr>
+            <w:tcBorders>
+              <w:bottom w:val="single" w:sz="12" w:space="0" w:color="666666"/>
+              <w:top w:val="none" w:sz="0" w:space="0" w:color="000000"/>
+              <w:left w:val="none" w:sz="0" w:space="0" w:color="000000"/>
+              <w:right w:val="none" w:sz="0" w:space="0" w:color="000000"/>
+            </w:tcBorders>
+            <w:shd w:val="clear" w:color="auto" w:fill="FFFFFF"/>
+            <w:tcMar>
+              <w:top w:w="0" w:type="dxa"/>
+              <w:bottom w:w="0" w:type="dxa"/>
+              <w:left w:w="0" w:type="dxa"/>
+              <w:right w:w="0" w:type="dxa"/>
+            </w:tcMar>
+            <w:vAlign w:val="center"/>
+          </w:tcPr>
+          <w:p>
+            <w:pPr>
+              <w:jc w:val="left"/>
+              <w:pBdr>
+                <w:bottom w:val="none" w:sz="0" w:space="0" w:color="000000"/>
+                <w:top w:val="none" w:sz="0" w:space="0" w:color="000000"/>
+                <w:left w:val="none" w:sz="0" w:space="0" w:color="000000"/>
+                <w:right w:val="none" w:sz="0" w:space="0" w:color="000000"/>
+              </w:pBdr>
+              <w:spacing w:after="100" w:before="100" w:line="240"/>
+              <w:ind w:left="100" w:right="100" w:firstLine="0" w:firstLineChars="0"/>
+              <w:rPr>
+                <w:rFonts w:ascii="Helvetica" w:hAnsi="Helvetica" w:eastAsia="Helvetica" w:cs="Helvetica"/>
+                <w:i w:val="false"/>
+                <w:b w:val="false"/>
+                <w:u w:val="none"/>
+                <w:sz w:val="22"/>
+                <w:szCs w:val="22"/>
+                <w:color w:val="000000"/>
+              </w:rPr>
+            </w:pPr>
+            <w:r>
+              <w:rPr>
+                <w:rFonts w:ascii="Helvetica" w:hAnsi="Helvetica" w:eastAsia="Helvetica" w:cs="Helvetica"/>
+                <w:i w:val="false"/>
+                <w:b w:val="false"/>
+                <w:u w:val="none"/>
+                <w:sz w:val="22"/>
+                <w:szCs w:val="22"/>
+                <w:color w:val="000000"/>
+              </w:rPr>
+              <w:t xml:space="preserve">1.250</w:t>
+            </w:r>
+          </w:p>
+        </w:tc>
+        <w:tc>
+          <w:tcPr>
+            <w:tcBorders>
+              <w:bottom w:val="single" w:sz="12" w:space="0" w:color="666666"/>
+              <w:top w:val="none" w:sz="0" w:space="0" w:color="000000"/>
+              <w:left w:val="none" w:sz="0" w:space="0" w:color="000000"/>
+              <w:right w:val="none" w:sz="0" w:space="0" w:color="000000"/>
+            </w:tcBorders>
+            <w:shd w:val="clear" w:color="auto" w:fill="FFFFFF"/>
+            <w:tcMar>
+              <w:top w:w="0" w:type="dxa"/>
+              <w:bottom w:w="0" w:type="dxa"/>
+              <w:left w:w="0" w:type="dxa"/>
+              <w:right w:w="0" w:type="dxa"/>
+            </w:tcMar>
+            <w:vAlign w:val="center"/>
+          </w:tcPr>
+          <w:p>
+            <w:pPr>
+              <w:jc w:val="left"/>
+              <w:pBdr>
+                <w:bottom w:val="none" w:sz="0" w:space="0" w:color="000000"/>
+                <w:top w:val="none" w:sz="0" w:space="0" w:color="000000"/>
+                <w:left w:val="none" w:sz="0" w:space="0" w:color="000000"/>
+                <w:right w:val="none" w:sz="0" w:space="0" w:color="000000"/>
+              </w:pBdr>
+              <w:spacing w:after="100" w:before="100" w:line="240"/>
+              <w:ind w:left="100" w:right="100" w:firstLine="0" w:firstLineChars="0"/>
+              <w:rPr>
+                <w:rFonts w:ascii="Helvetica" w:hAnsi="Helvetica" w:eastAsia="Helvetica" w:cs="Helvetica"/>
+                <w:i w:val="false"/>
+                <w:b w:val="false"/>
+                <w:u w:val="none"/>
+                <w:sz w:val="22"/>
+                <w:szCs w:val="22"/>
+                <w:color w:val="000000"/>
+              </w:rPr>
+            </w:pPr>
+            <w:r>
+              <w:rPr>
+                <w:rFonts w:ascii="Helvetica" w:hAnsi="Helvetica" w:eastAsia="Helvetica" w:cs="Helvetica"/>
+                <w:i w:val="false"/>
+                <w:b w:val="false"/>
+                <w:u w:val="none"/>
+                <w:sz w:val="22"/>
+                <w:szCs w:val="22"/>
+                <w:color w:val="000000"/>
+              </w:rPr>
+              <w:t xml:space="preserve">1.66</w:t>
+            </w:r>
+          </w:p>
+        </w:tc>
+        <w:tc>
+          <w:tcPr>
+            <w:tcBorders>
+              <w:bottom w:val="single" w:sz="12" w:space="0" w:color="666666"/>
+              <w:top w:val="none" w:sz="0" w:space="0" w:color="000000"/>
+              <w:left w:val="none" w:sz="0" w:space="0" w:color="000000"/>
+              <w:right w:val="none" w:sz="0" w:space="0" w:color="000000"/>
+            </w:tcBorders>
+            <w:shd w:val="clear" w:color="auto" w:fill="FFFFFF"/>
+            <w:tcMar>
+              <w:top w:w="0" w:type="dxa"/>
+              <w:bottom w:w="0" w:type="dxa"/>
+              <w:left w:w="0" w:type="dxa"/>
+              <w:right w:w="0" w:type="dxa"/>
+            </w:tcMar>
+            <w:vAlign w:val="center"/>
+          </w:tcPr>
+          <w:p>
+            <w:pPr>
+              <w:jc w:val="left"/>
+              <w:pBdr>
+                <w:bottom w:val="none" w:sz="0" w:space="0" w:color="000000"/>
+                <w:top w:val="none" w:sz="0" w:space="0" w:color="000000"/>
+                <w:left w:val="none" w:sz="0" w:space="0" w:color="000000"/>
+                <w:right w:val="none" w:sz="0" w:space="0" w:color="000000"/>
+              </w:pBdr>
+              <w:spacing w:after="100" w:before="100" w:line="240"/>
+              <w:ind w:left="100" w:right="100" w:firstLine="0" w:firstLineChars="0"/>
+              <w:rPr>
+                <w:rFonts w:ascii="Helvetica" w:hAnsi="Helvetica" w:eastAsia="Helvetica" w:cs="Helvetica"/>
+                <w:i w:val="false"/>
+                <w:b w:val="false"/>
+                <w:u w:val="none"/>
+                <w:sz w:val="22"/>
+                <w:szCs w:val="22"/>
+                <w:color w:val="000000"/>
+              </w:rPr>
+            </w:pPr>
+            <w:r>
+              <w:rPr>
+                <w:rFonts w:ascii="Helvetica" w:hAnsi="Helvetica" w:eastAsia="Helvetica" w:cs="Helvetica"/>
+                <w:i w:val="false"/>
+                <w:b w:val="false"/>
+                <w:u w:val="none"/>
+                <w:sz w:val="22"/>
+                <w:szCs w:val="22"/>
+                <w:color w:val="000000"/>
+              </w:rPr>
+              <w:t xml:space="preserve">1.370</w:t>
             </w:r>
           </w:p>
         </w:tc>

</xml_diff>